<commit_message>
docs(decisions): chantier reseau federatif v2 - amendement carte umap
</commit_message>
<xml_diff>
--- a/docs/decisions/CHANTIER_reseau_federatif_2026-05-25.docx
+++ b/docs/decisions/CHANTIER_reseau_federatif_2026-05-25.docx
@@ -90,7 +90,7 @@
           <w:sz w:val="22"/>
           <w:szCs w:val="22"/>
         </w:rPr>
-        <w:t xml:space="preserve">Document de travail — version 1</w:t>
+        <w:t xml:space="preserve">Document de travail — version 2</w:t>
       </w:r>
     </w:p>
     <w:p>
@@ -104,7 +104,7 @@
           <w:sz w:val="22"/>
           <w:szCs w:val="22"/>
         </w:rPr>
-        <w:t xml:space="preserve">25 mai 2026</w:t>
+        <w:t xml:space="preserve">25 mai 2026 — amendé le 26 mai 2026 (carte du réseau)</w:t>
       </w:r>
     </w:p>
     <w:p>
@@ -5425,7 +5425,1374 @@
         <w:spacing w:after="120" w:line="312"/>
       </w:pPr>
       <w:r>
-        <w:t xml:space="preserve">Une représentation cartographique, et/ou par cercles, des bibliothèques membres — dans l’application comme, à terme, sur le site public. Pour une fédération, se voir est déjà un acte politique. Réserve importante : certaines bibliothèques militantes peuvent vouloir rester non localisées, pour des raisons de sécurité. La carte doit donc respecter un niveau de visibilité choisi par chaque bibliothèque — ce que l’infrastructure de visibilité sait déjà faire.</w:t>
+        <w:t xml:space="preserve">Une représentation cartographique, et/ou par cercles, des bibliothèques membres — dans l’application comme, à terme, sur le site public. Pour une fédération, se voir est déjà un acte politique. Cette piste fait l’objet d’un développement propre ci-dessous (section 6.5 bis), à la suite de l’amendement du 26 mai 2026.</w:t>
+      </w:r>
+    </w:p>
+    <w:p>
+      <w:pPr>
+        <w:pStyle w:val="Heading3"/>
+      </w:pPr>
+      <w:r>
+        <w:t xml:space="preserve">6.5 bis La carte du réseau — précisions de l’amendement du 26 mai 2026</w:t>
+      </w:r>
+    </w:p>
+    <w:p>
+      <w:pPr>
+        <w:spacing w:after="120" w:line="312"/>
+      </w:pPr>
+      <w:r>
+        <w:rPr>
+          <w:b/>
+          <w:bCs/>
+        </w:rPr>
+        <w:t xml:space="preserve">Contexte de l’amendement. </w:t>
+      </w:r>
+      <w:r>
+        <w:t xml:space="preserve">Une cartographie uMap des collectifs libertaires disposant d’une bibliothèque, dans le monde, a été produite indépendamment d’AnarBib. Elle change le statut de cette piste : le travail le plus difficile — recenser et géolocaliser — n’est pas technique mais documentaire, et il est déjà largement fait. uMap expose ses données en GeoJSON, donc sous une forme exploitable. La piste 6.5 n’est plus « construire une carte » mais « intégrer proprement une carte qui existe déjà ».</w:t>
+      </w:r>
+    </w:p>
+    <w:p>
+      <w:pPr>
+        <w:spacing w:after="120" w:line="312"/>
+      </w:pPr>
+      <w:r>
+        <w:t xml:space="preserve">Mais cette intégration impose une distinction doctrinale, qui est le cœur de cet amendement. La carte fait coexister deux populations de nature différente, qu’il ne faut jamais confondre.</w:t>
+      </w:r>
+    </w:p>
+    <w:tbl>
+      <w:tblPr>
+        <w:tblW w:type="dxa" w:w="9360"/>
+        <w:tblBorders>
+          <w:top w:val="single" w:color="auto" w:sz="4"/>
+          <w:left w:val="single" w:color="auto" w:sz="4"/>
+          <w:bottom w:val="single" w:color="auto" w:sz="4"/>
+          <w:right w:val="single" w:color="auto" w:sz="4"/>
+          <w:insideH w:val="single" w:color="auto" w:sz="4"/>
+          <w:insideV w:val="single" w:color="auto" w:sz="4"/>
+        </w:tblBorders>
+      </w:tblPr>
+      <w:tblGrid>
+        <w:gridCol w:w="2400"/>
+        <w:gridCol w:w="6960"/>
+      </w:tblGrid>
+      <w:tr>
+        <w:trPr>
+          <w:tblHeader/>
+        </w:trPr>
+        <w:tc>
+          <w:tcPr>
+            <w:tcW w:type="dxa" w:w="2400"/>
+            <w:tcBorders>
+              <w:top w:val="single" w:color="CCCCCC" w:sz="2"/>
+              <w:left w:val="single" w:color="CCCCCC" w:sz="2"/>
+              <w:bottom w:val="single" w:color="CCCCCC" w:sz="2"/>
+              <w:right w:val="single" w:color="CCCCCC" w:sz="2"/>
+            </w:tcBorders>
+            <w:shd w:fill="B32025" w:val="clear"/>
+            <w:tcMar>
+              <w:top w:type="dxa" w:w="80"/>
+              <w:left w:type="dxa" w:w="120"/>
+              <w:bottom w:type="dxa" w:w="80"/>
+              <w:right w:type="dxa" w:w="120"/>
+            </w:tcMar>
+          </w:tcPr>
+          <w:p>
+            <w:pPr>
+              <w:spacing w:after="20" w:line="270"/>
+            </w:pPr>
+            <w:r>
+              <w:rPr>
+                <w:b/>
+                <w:bCs/>
+                <w:color w:val="FFFFFF"/>
+                <w:sz w:val="20"/>
+                <w:szCs w:val="20"/>
+              </w:rPr>
+              <w:t xml:space="preserve">Population</w:t>
+            </w:r>
+          </w:p>
+        </w:tc>
+        <w:tc>
+          <w:tcPr>
+            <w:tcW w:type="dxa" w:w="6960"/>
+            <w:tcBorders>
+              <w:top w:val="single" w:color="CCCCCC" w:sz="2"/>
+              <w:left w:val="single" w:color="CCCCCC" w:sz="2"/>
+              <w:bottom w:val="single" w:color="CCCCCC" w:sz="2"/>
+              <w:right w:val="single" w:color="CCCCCC" w:sz="2"/>
+            </w:tcBorders>
+            <w:shd w:fill="B32025" w:val="clear"/>
+            <w:tcMar>
+              <w:top w:type="dxa" w:w="80"/>
+              <w:left w:type="dxa" w:w="120"/>
+              <w:bottom w:type="dxa" w:w="80"/>
+              <w:right w:type="dxa" w:w="120"/>
+            </w:tcMar>
+          </w:tcPr>
+          <w:p>
+            <w:pPr>
+              <w:spacing w:after="20" w:line="270"/>
+            </w:pPr>
+            <w:r>
+              <w:rPr>
+                <w:b/>
+                <w:bCs/>
+                <w:color w:val="FFFFFF"/>
+                <w:sz w:val="20"/>
+                <w:szCs w:val="20"/>
+              </w:rPr>
+              <w:t xml:space="preserve">Définition et statut</w:t>
+            </w:r>
+          </w:p>
+        </w:tc>
+      </w:tr>
+      <w:tr>
+        <w:trPr>
+          <w:tblHeader w:val="false"/>
+        </w:trPr>
+        <w:tc>
+          <w:tcPr>
+            <w:tcW w:type="dxa" w:w="2400"/>
+            <w:tcBorders>
+              <w:top w:val="single" w:color="CCCCCC" w:sz="2"/>
+              <w:left w:val="single" w:color="CCCCCC" w:sz="2"/>
+              <w:bottom w:val="single" w:color="CCCCCC" w:sz="2"/>
+              <w:right w:val="single" w:color="CCCCCC" w:sz="2"/>
+            </w:tcBorders>
+            <w:shd w:fill="FFFFFF" w:val="clear"/>
+            <w:tcMar>
+              <w:top w:type="dxa" w:w="80"/>
+              <w:left w:type="dxa" w:w="120"/>
+              <w:bottom w:type="dxa" w:w="80"/>
+              <w:right w:type="dxa" w:w="120"/>
+            </w:tcMar>
+          </w:tcPr>
+          <w:p>
+            <w:pPr>
+              <w:spacing w:after="20" w:line="270"/>
+            </w:pPr>
+            <w:r>
+              <w:rPr>
+                <w:b w:val="false"/>
+                <w:bCs w:val="false"/>
+                <w:color w:val="1A1A1A"/>
+                <w:sz w:val="20"/>
+                <w:szCs w:val="20"/>
+              </w:rPr>
+              <w:t xml:space="preserve">Collectifs recensés</w:t>
+            </w:r>
+          </w:p>
+        </w:tc>
+        <w:tc>
+          <w:tcPr>
+            <w:tcW w:type="dxa" w:w="6960"/>
+            <w:tcBorders>
+              <w:top w:val="single" w:color="CCCCCC" w:sz="2"/>
+              <w:left w:val="single" w:color="CCCCCC" w:sz="2"/>
+              <w:bottom w:val="single" w:color="CCCCCC" w:sz="2"/>
+              <w:right w:val="single" w:color="CCCCCC" w:sz="2"/>
+            </w:tcBorders>
+            <w:shd w:fill="FFFFFF" w:val="clear"/>
+            <w:tcMar>
+              <w:top w:type="dxa" w:w="80"/>
+              <w:left w:type="dxa" w:w="120"/>
+              <w:bottom w:type="dxa" w:w="80"/>
+              <w:right w:type="dxa" w:w="120"/>
+            </w:tcMar>
+          </w:tcPr>
+          <w:p>
+            <w:pPr>
+              <w:spacing w:after="20" w:line="270"/>
+            </w:pPr>
+            <w:r>
+              <w:rPr>
+                <w:b w:val="false"/>
+                <w:bCs w:val="false"/>
+                <w:color w:val="1A1A1A"/>
+                <w:sz w:val="20"/>
+                <w:szCs w:val="20"/>
+              </w:rPr>
+              <w:t xml:space="preserve">La cartographie militante du milieu. Un point ne suppose aucun consentement du collectif, aucune inscription, aucune existence dans la base AnarBib. C’est une connaissance sur le mouvement.</w:t>
+            </w:r>
+          </w:p>
+        </w:tc>
+      </w:tr>
+      <w:tr>
+        <w:trPr>
+          <w:tblHeader w:val="false"/>
+        </w:trPr>
+        <w:tc>
+          <w:tcPr>
+            <w:tcW w:type="dxa" w:w="2400"/>
+            <w:tcBorders>
+              <w:top w:val="single" w:color="CCCCCC" w:sz="2"/>
+              <w:left w:val="single" w:color="CCCCCC" w:sz="2"/>
+              <w:bottom w:val="single" w:color="CCCCCC" w:sz="2"/>
+              <w:right w:val="single" w:color="CCCCCC" w:sz="2"/>
+            </w:tcBorders>
+            <w:shd w:fill="FFFFFF" w:val="clear"/>
+            <w:tcMar>
+              <w:top w:type="dxa" w:w="80"/>
+              <w:left w:type="dxa" w:w="120"/>
+              <w:bottom w:type="dxa" w:w="80"/>
+              <w:right w:type="dxa" w:w="120"/>
+            </w:tcMar>
+          </w:tcPr>
+          <w:p>
+            <w:pPr>
+              <w:spacing w:after="20" w:line="270"/>
+            </w:pPr>
+            <w:r>
+              <w:rPr>
+                <w:b w:val="false"/>
+                <w:bCs w:val="false"/>
+                <w:color w:val="1A1A1A"/>
+                <w:sz w:val="20"/>
+                <w:szCs w:val="20"/>
+              </w:rPr>
+              <w:t xml:space="preserve">Bibliothèques membres</w:t>
+            </w:r>
+          </w:p>
+        </w:tc>
+        <w:tc>
+          <w:tcPr>
+            <w:tcW w:type="dxa" w:w="6960"/>
+            <w:tcBorders>
+              <w:top w:val="single" w:color="CCCCCC" w:sz="2"/>
+              <w:left w:val="single" w:color="CCCCCC" w:sz="2"/>
+              <w:bottom w:val="single" w:color="CCCCCC" w:sz="2"/>
+              <w:right w:val="single" w:color="CCCCCC" w:sz="2"/>
+            </w:tcBorders>
+            <w:shd w:fill="FFFFFF" w:val="clear"/>
+            <w:tcMar>
+              <w:top w:type="dxa" w:w="80"/>
+              <w:left w:type="dxa" w:w="120"/>
+              <w:bottom w:type="dxa" w:w="80"/>
+              <w:right w:type="dxa" w:w="120"/>
+            </w:tcMar>
+          </w:tcPr>
+          <w:p>
+            <w:pPr>
+              <w:spacing w:after="20" w:line="270"/>
+            </w:pPr>
+            <w:r>
+              <w:rPr>
+                <w:b w:val="false"/>
+                <w:bCs w:val="false"/>
+                <w:color w:val="1A1A1A"/>
+                <w:sz w:val="20"/>
+                <w:szCs w:val="20"/>
+              </w:rPr>
+              <w:t xml:space="preserve">Celles qui ont une bibliothèque dans AnarBib — identifiant, équipe, catalogue. Elles ont fait acte d’adhésion et existent dans la base. C’est la fédération effective.</w:t>
+            </w:r>
+          </w:p>
+        </w:tc>
+      </w:tr>
+    </w:tbl>
+    <w:p>
+      <w:pPr>
+        <w:spacing w:after="80"/>
+      </w:pPr>
+      <w:r>
+        <w:t xml:space="preserve"/>
+      </w:r>
+    </w:p>
+    <w:p>
+      <w:pPr>
+        <w:spacing w:after="120" w:line="312"/>
+      </w:pPr>
+      <w:r>
+        <w:t xml:space="preserve">Les deux ensembles se recoupent partiellement : une bibliothèque membre est presque toujours aussi un collectif recensé, mais l’inverse est faux et le restera — beaucoup de collectifs n’utiliseront jamais AnarBib, et c’est très bien ainsi. Afficher les deux populations ensemble est politiquement fort : cela montre AnarBib comme une partie d’un mouvement plus vaste, et non comme le mouvement lui-même — exactement la posture « commun en construction » de la stratégie du projet. Mais cela impose une rigueur absolue : la carte ne doit jamais laisser croire qu’un collectif recensé est membre d’AnarBib alors qu’il n’a rien demandé.</w:t>
+      </w:r>
+    </w:p>
+    <w:p>
+      <w:pPr>
+        <w:pStyle w:val="Heading3"/>
+      </w:pPr>
+      <w:r>
+        <w:t xml:space="preserve">Deux décisions arrêtées par l’amendement</w:t>
+      </w:r>
+    </w:p>
+    <w:tbl>
+      <w:tblPr>
+        <w:tblW w:type="dxa" w:w="9360"/>
+        <w:tblBorders>
+          <w:top w:val="single" w:color="auto" w:sz="4"/>
+          <w:left w:val="single" w:color="auto" w:sz="4"/>
+          <w:bottom w:val="single" w:color="auto" w:sz="4"/>
+          <w:right w:val="single" w:color="auto" w:sz="4"/>
+          <w:insideH w:val="single" w:color="auto" w:sz="4"/>
+          <w:insideV w:val="single" w:color="auto" w:sz="4"/>
+        </w:tblBorders>
+      </w:tblPr>
+      <w:tblGrid>
+        <w:gridCol w:w="2800"/>
+        <w:gridCol w:w="3280"/>
+        <w:gridCol w:w="3280"/>
+      </w:tblGrid>
+      <w:tr>
+        <w:trPr>
+          <w:tblHeader/>
+        </w:trPr>
+        <w:tc>
+          <w:tcPr>
+            <w:tcW w:type="dxa" w:w="2800"/>
+            <w:tcBorders>
+              <w:top w:val="single" w:color="CCCCCC" w:sz="2"/>
+              <w:left w:val="single" w:color="CCCCCC" w:sz="2"/>
+              <w:bottom w:val="single" w:color="CCCCCC" w:sz="2"/>
+              <w:right w:val="single" w:color="CCCCCC" w:sz="2"/>
+            </w:tcBorders>
+            <w:shd w:fill="B32025" w:val="clear"/>
+            <w:tcMar>
+              <w:top w:type="dxa" w:w="80"/>
+              <w:left w:type="dxa" w:w="120"/>
+              <w:bottom w:type="dxa" w:w="80"/>
+              <w:right w:type="dxa" w:w="120"/>
+            </w:tcMar>
+          </w:tcPr>
+          <w:p>
+            <w:pPr>
+              <w:spacing w:after="20" w:line="270"/>
+            </w:pPr>
+            <w:r>
+              <w:rPr>
+                <w:b/>
+                <w:bCs/>
+                <w:color w:val="FFFFFF"/>
+                <w:sz w:val="20"/>
+                <w:szCs w:val="20"/>
+              </w:rPr>
+              <w:t xml:space="preserve">Question</w:t>
+            </w:r>
+          </w:p>
+        </w:tc>
+        <w:tc>
+          <w:tcPr>
+            <w:tcW w:type="dxa" w:w="3280"/>
+            <w:tcBorders>
+              <w:top w:val="single" w:color="CCCCCC" w:sz="2"/>
+              <w:left w:val="single" w:color="CCCCCC" w:sz="2"/>
+              <w:bottom w:val="single" w:color="CCCCCC" w:sz="2"/>
+              <w:right w:val="single" w:color="CCCCCC" w:sz="2"/>
+            </w:tcBorders>
+            <w:shd w:fill="B32025" w:val="clear"/>
+            <w:tcMar>
+              <w:top w:type="dxa" w:w="80"/>
+              <w:left w:type="dxa" w:w="120"/>
+              <w:bottom w:type="dxa" w:w="80"/>
+              <w:right w:type="dxa" w:w="120"/>
+            </w:tcMar>
+          </w:tcPr>
+          <w:p>
+            <w:pPr>
+              <w:spacing w:after="20" w:line="270"/>
+            </w:pPr>
+            <w:r>
+              <w:rPr>
+                <w:b/>
+                <w:bCs/>
+                <w:color w:val="FFFFFF"/>
+                <w:sz w:val="20"/>
+                <w:szCs w:val="20"/>
+              </w:rPr>
+              <w:t xml:space="preserve">Décision</w:t>
+            </w:r>
+          </w:p>
+        </w:tc>
+        <w:tc>
+          <w:tcPr>
+            <w:tcW w:type="dxa" w:w="3280"/>
+            <w:tcBorders>
+              <w:top w:val="single" w:color="CCCCCC" w:sz="2"/>
+              <w:left w:val="single" w:color="CCCCCC" w:sz="2"/>
+              <w:bottom w:val="single" w:color="CCCCCC" w:sz="2"/>
+              <w:right w:val="single" w:color="CCCCCC" w:sz="2"/>
+            </w:tcBorders>
+            <w:shd w:fill="B32025" w:val="clear"/>
+            <w:tcMar>
+              <w:top w:type="dxa" w:w="80"/>
+              <w:left w:type="dxa" w:w="120"/>
+              <w:bottom w:type="dxa" w:w="80"/>
+              <w:right w:type="dxa" w:w="120"/>
+            </w:tcMar>
+          </w:tcPr>
+          <w:p>
+            <w:pPr>
+              <w:spacing w:after="20" w:line="270"/>
+            </w:pPr>
+            <w:r>
+              <w:rPr>
+                <w:b/>
+                <w:bCs/>
+                <w:color w:val="FFFFFF"/>
+                <w:sz w:val="20"/>
+                <w:szCs w:val="20"/>
+              </w:rPr>
+              <w:t xml:space="preserve">Justification</w:t>
+            </w:r>
+          </w:p>
+        </w:tc>
+      </w:tr>
+      <w:tr>
+        <w:trPr>
+          <w:tblHeader w:val="false"/>
+        </w:trPr>
+        <w:tc>
+          <w:tcPr>
+            <w:tcW w:type="dxa" w:w="2800"/>
+            <w:tcBorders>
+              <w:top w:val="single" w:color="CCCCCC" w:sz="2"/>
+              <w:left w:val="single" w:color="CCCCCC" w:sz="2"/>
+              <w:bottom w:val="single" w:color="CCCCCC" w:sz="2"/>
+              <w:right w:val="single" w:color="CCCCCC" w:sz="2"/>
+            </w:tcBorders>
+            <w:shd w:fill="FFFFFF" w:val="clear"/>
+            <w:tcMar>
+              <w:top w:type="dxa" w:w="80"/>
+              <w:left w:type="dxa" w:w="120"/>
+              <w:bottom w:type="dxa" w:w="80"/>
+              <w:right w:type="dxa" w:w="120"/>
+            </w:tcMar>
+          </w:tcPr>
+          <w:p>
+            <w:pPr>
+              <w:spacing w:after="20" w:line="270"/>
+            </w:pPr>
+            <w:r>
+              <w:rPr>
+                <w:b w:val="false"/>
+                <w:bCs w:val="false"/>
+                <w:color w:val="1A1A1A"/>
+                <w:sz w:val="20"/>
+                <w:szCs w:val="20"/>
+              </w:rPr>
+              <w:t xml:space="preserve">Rapport carte uMap / AnarBib sur le long terme</w:t>
+            </w:r>
+          </w:p>
+        </w:tc>
+        <w:tc>
+          <w:tcPr>
+            <w:tcW w:type="dxa" w:w="3280"/>
+            <w:tcBorders>
+              <w:top w:val="single" w:color="CCCCCC" w:sz="2"/>
+              <w:left w:val="single" w:color="CCCCCC" w:sz="2"/>
+              <w:bottom w:val="single" w:color="CCCCCC" w:sz="2"/>
+              <w:right w:val="single" w:color="CCCCCC" w:sz="2"/>
+            </w:tcBorders>
+            <w:shd w:fill="FFFFFF" w:val="clear"/>
+            <w:tcMar>
+              <w:top w:type="dxa" w:w="80"/>
+              <w:left w:type="dxa" w:w="120"/>
+              <w:bottom w:type="dxa" w:w="80"/>
+              <w:right w:type="dxa" w:w="120"/>
+            </w:tcMar>
+          </w:tcPr>
+          <w:p>
+            <w:pPr>
+              <w:spacing w:after="20" w:line="270"/>
+            </w:pPr>
+            <w:r>
+              <w:rPr>
+                <w:b w:val="false"/>
+                <w:bCs w:val="false"/>
+                <w:color w:val="1A1A1A"/>
+                <w:sz w:val="20"/>
+                <w:szCs w:val="20"/>
+              </w:rPr>
+              <w:t xml:space="preserve">uMap reste la source du calque « milieu ». AnarBib ne gère que ses bibliothèques membres.</w:t>
+            </w:r>
+          </w:p>
+        </w:tc>
+        <w:tc>
+          <w:tcPr>
+            <w:tcW w:type="dxa" w:w="3280"/>
+            <w:tcBorders>
+              <w:top w:val="single" w:color="CCCCCC" w:sz="2"/>
+              <w:left w:val="single" w:color="CCCCCC" w:sz="2"/>
+              <w:bottom w:val="single" w:color="CCCCCC" w:sz="2"/>
+              <w:right w:val="single" w:color="CCCCCC" w:sz="2"/>
+            </w:tcBorders>
+            <w:shd w:fill="FFFFFF" w:val="clear"/>
+            <w:tcMar>
+              <w:top w:type="dxa" w:w="80"/>
+              <w:left w:type="dxa" w:w="120"/>
+              <w:bottom w:type="dxa" w:w="80"/>
+              <w:right w:type="dxa" w:w="120"/>
+            </w:tcMar>
+          </w:tcPr>
+          <w:p>
+            <w:pPr>
+              <w:spacing w:after="20" w:line="270"/>
+            </w:pPr>
+            <w:r>
+              <w:rPr>
+                <w:b w:val="false"/>
+                <w:bCs w:val="false"/>
+                <w:color w:val="1A1A1A"/>
+                <w:sz w:val="20"/>
+                <w:szCs w:val="20"/>
+              </w:rPr>
+              <w:t xml:space="preserve">La cartographie militante est une ressource du mouvement ; elle doit rester éditable hors d’AnarBib, y compris par des collectifs qui ne voudront jamais de l’outil. Faire migrer le milieu dans AnarBib ferait du SIGB le propriétaire d’une connaissance collective — contraire à la posture « commun, pas centre ».</w:t>
+            </w:r>
+          </w:p>
+        </w:tc>
+      </w:tr>
+      <w:tr>
+        <w:trPr>
+          <w:tblHeader w:val="false"/>
+        </w:trPr>
+        <w:tc>
+          <w:tcPr>
+            <w:tcW w:type="dxa" w:w="2800"/>
+            <w:tcBorders>
+              <w:top w:val="single" w:color="CCCCCC" w:sz="2"/>
+              <w:left w:val="single" w:color="CCCCCC" w:sz="2"/>
+              <w:bottom w:val="single" w:color="CCCCCC" w:sz="2"/>
+              <w:right w:val="single" w:color="CCCCCC" w:sz="2"/>
+            </w:tcBorders>
+            <w:shd w:fill="FFFFFF" w:val="clear"/>
+            <w:tcMar>
+              <w:top w:type="dxa" w:w="80"/>
+              <w:left w:type="dxa" w:w="120"/>
+              <w:bottom w:type="dxa" w:w="80"/>
+              <w:right w:type="dxa" w:w="120"/>
+            </w:tcMar>
+          </w:tcPr>
+          <w:p>
+            <w:pPr>
+              <w:spacing w:after="20" w:line="270"/>
+            </w:pPr>
+            <w:r>
+              <w:rPr>
+                <w:b w:val="false"/>
+                <w:bCs w:val="false"/>
+                <w:color w:val="1A1A1A"/>
+                <w:sz w:val="20"/>
+                <w:szCs w:val="20"/>
+              </w:rPr>
+              <w:t xml:space="preserve">Alimentation du calque « milieu »</w:t>
+            </w:r>
+          </w:p>
+        </w:tc>
+        <w:tc>
+          <w:tcPr>
+            <w:tcW w:type="dxa" w:w="3280"/>
+            <w:tcBorders>
+              <w:top w:val="single" w:color="CCCCCC" w:sz="2"/>
+              <w:left w:val="single" w:color="CCCCCC" w:sz="2"/>
+              <w:bottom w:val="single" w:color="CCCCCC" w:sz="2"/>
+              <w:right w:val="single" w:color="CCCCCC" w:sz="2"/>
+            </w:tcBorders>
+            <w:shd w:fill="FFFFFF" w:val="clear"/>
+            <w:tcMar>
+              <w:top w:type="dxa" w:w="80"/>
+              <w:left w:type="dxa" w:w="120"/>
+              <w:bottom w:type="dxa" w:w="80"/>
+              <w:right w:type="dxa" w:w="120"/>
+            </w:tcMar>
+          </w:tcPr>
+          <w:p>
+            <w:pPr>
+              <w:spacing w:after="20" w:line="270"/>
+            </w:pPr>
+            <w:r>
+              <w:rPr>
+                <w:b w:val="false"/>
+                <w:bCs w:val="false"/>
+                <w:color w:val="1A1A1A"/>
+                <w:sz w:val="20"/>
+                <w:szCs w:val="20"/>
+              </w:rPr>
+              <w:t xml:space="preserve">Le GeoJSON uMap est récupéré périodiquement et stocké côté AnarBib.</w:t>
+            </w:r>
+          </w:p>
+        </w:tc>
+        <w:tc>
+          <w:tcPr>
+            <w:tcW w:type="dxa" w:w="3280"/>
+            <w:tcBorders>
+              <w:top w:val="single" w:color="CCCCCC" w:sz="2"/>
+              <w:left w:val="single" w:color="CCCCCC" w:sz="2"/>
+              <w:bottom w:val="single" w:color="CCCCCC" w:sz="2"/>
+              <w:right w:val="single" w:color="CCCCCC" w:sz="2"/>
+            </w:tcBorders>
+            <w:shd w:fill="FFFFFF" w:val="clear"/>
+            <w:tcMar>
+              <w:top w:type="dxa" w:w="80"/>
+              <w:left w:type="dxa" w:w="120"/>
+              <w:bottom w:type="dxa" w:w="80"/>
+              <w:right w:type="dxa" w:w="120"/>
+            </w:tcMar>
+          </w:tcPr>
+          <w:p>
+            <w:pPr>
+              <w:spacing w:after="20" w:line="270"/>
+            </w:pPr>
+            <w:r>
+              <w:rPr>
+                <w:b w:val="false"/>
+                <w:bCs w:val="false"/>
+                <w:color w:val="1A1A1A"/>
+                <w:sz w:val="20"/>
+                <w:szCs w:val="20"/>
+              </w:rPr>
+              <w:t xml:space="preserve">Pointer uMap en direct créerait une dépendance d’affichage : si uMap est lent ou indisponible, l’onglet Carte casse. Une copie maîtrisée rend AnarBib autonome à l’affichage — même esprit que la doctrine « pas d’action sans dump courant ». uMap demeure la source d’édition.</w:t>
+            </w:r>
+          </w:p>
+        </w:tc>
+      </w:tr>
+    </w:tbl>
+    <w:p>
+      <w:pPr>
+        <w:pStyle w:val="Heading3"/>
+      </w:pPr>
+      <w:r>
+        <w:t xml:space="preserve">Architecture retenue : deux calques distincts</w:t>
+      </w:r>
+    </w:p>
+    <w:p>
+      <w:pPr>
+        <w:spacing w:after="120" w:line="312"/>
+      </w:pPr>
+      <w:r>
+        <w:t xml:space="preserve">L’onglet Carte de la face fédération afficherait deux calques visuellement non ambigus, l’un au-dessus de l’autre.</w:t>
+      </w:r>
+    </w:p>
+    <w:tbl>
+      <w:tblPr>
+        <w:tblW w:type="dxa" w:w="9360"/>
+        <w:tblBorders>
+          <w:top w:val="single" w:color="auto" w:sz="4"/>
+          <w:left w:val="single" w:color="auto" w:sz="4"/>
+          <w:bottom w:val="single" w:color="auto" w:sz="4"/>
+          <w:right w:val="single" w:color="auto" w:sz="4"/>
+          <w:insideH w:val="single" w:color="auto" w:sz="4"/>
+          <w:insideV w:val="single" w:color="auto" w:sz="4"/>
+        </w:tblBorders>
+      </w:tblPr>
+      <w:tblGrid>
+        <w:gridCol w:w="2200"/>
+        <w:gridCol w:w="3580"/>
+        <w:gridCol w:w="3580"/>
+      </w:tblGrid>
+      <w:tr>
+        <w:trPr>
+          <w:tblHeader/>
+        </w:trPr>
+        <w:tc>
+          <w:tcPr>
+            <w:tcW w:type="dxa" w:w="2200"/>
+            <w:tcBorders>
+              <w:top w:val="single" w:color="CCCCCC" w:sz="2"/>
+              <w:left w:val="single" w:color="CCCCCC" w:sz="2"/>
+              <w:bottom w:val="single" w:color="CCCCCC" w:sz="2"/>
+              <w:right w:val="single" w:color="CCCCCC" w:sz="2"/>
+            </w:tcBorders>
+            <w:shd w:fill="B32025" w:val="clear"/>
+            <w:tcMar>
+              <w:top w:type="dxa" w:w="80"/>
+              <w:left w:type="dxa" w:w="120"/>
+              <w:bottom w:type="dxa" w:w="80"/>
+              <w:right w:type="dxa" w:w="120"/>
+            </w:tcMar>
+          </w:tcPr>
+          <w:p>
+            <w:pPr>
+              <w:spacing w:after="20" w:line="270"/>
+            </w:pPr>
+            <w:r>
+              <w:rPr>
+                <w:b/>
+                <w:bCs/>
+                <w:color w:val="FFFFFF"/>
+                <w:sz w:val="20"/>
+                <w:szCs w:val="20"/>
+              </w:rPr>
+              <w:t xml:space="preserve">Calque</w:t>
+            </w:r>
+          </w:p>
+        </w:tc>
+        <w:tc>
+          <w:tcPr>
+            <w:tcW w:type="dxa" w:w="3580"/>
+            <w:tcBorders>
+              <w:top w:val="single" w:color="CCCCCC" w:sz="2"/>
+              <w:left w:val="single" w:color="CCCCCC" w:sz="2"/>
+              <w:bottom w:val="single" w:color="CCCCCC" w:sz="2"/>
+              <w:right w:val="single" w:color="CCCCCC" w:sz="2"/>
+            </w:tcBorders>
+            <w:shd w:fill="B32025" w:val="clear"/>
+            <w:tcMar>
+              <w:top w:type="dxa" w:w="80"/>
+              <w:left w:type="dxa" w:w="120"/>
+              <w:bottom w:type="dxa" w:w="80"/>
+              <w:right w:type="dxa" w:w="120"/>
+            </w:tcMar>
+          </w:tcPr>
+          <w:p>
+            <w:pPr>
+              <w:spacing w:after="20" w:line="270"/>
+            </w:pPr>
+            <w:r>
+              <w:rPr>
+                <w:b/>
+                <w:bCs/>
+                <w:color w:val="FFFFFF"/>
+                <w:sz w:val="20"/>
+                <w:szCs w:val="20"/>
+              </w:rPr>
+              <w:t xml:space="preserve">Le milieu</w:t>
+            </w:r>
+          </w:p>
+        </w:tc>
+        <w:tc>
+          <w:tcPr>
+            <w:tcW w:type="dxa" w:w="3580"/>
+            <w:tcBorders>
+              <w:top w:val="single" w:color="CCCCCC" w:sz="2"/>
+              <w:left w:val="single" w:color="CCCCCC" w:sz="2"/>
+              <w:bottom w:val="single" w:color="CCCCCC" w:sz="2"/>
+              <w:right w:val="single" w:color="CCCCCC" w:sz="2"/>
+            </w:tcBorders>
+            <w:shd w:fill="B32025" w:val="clear"/>
+            <w:tcMar>
+              <w:top w:type="dxa" w:w="80"/>
+              <w:left w:type="dxa" w:w="120"/>
+              <w:bottom w:type="dxa" w:w="80"/>
+              <w:right w:type="dxa" w:w="120"/>
+            </w:tcMar>
+          </w:tcPr>
+          <w:p>
+            <w:pPr>
+              <w:spacing w:after="20" w:line="270"/>
+            </w:pPr>
+            <w:r>
+              <w:rPr>
+                <w:b/>
+                <w:bCs/>
+                <w:color w:val="FFFFFF"/>
+                <w:sz w:val="20"/>
+                <w:szCs w:val="20"/>
+              </w:rPr>
+              <w:t xml:space="preserve">Membres d’AnarBib</w:t>
+            </w:r>
+          </w:p>
+        </w:tc>
+      </w:tr>
+      <w:tr>
+        <w:trPr>
+          <w:tblHeader w:val="false"/>
+        </w:trPr>
+        <w:tc>
+          <w:tcPr>
+            <w:tcW w:type="dxa" w:w="2200"/>
+            <w:tcBorders>
+              <w:top w:val="single" w:color="CCCCCC" w:sz="2"/>
+              <w:left w:val="single" w:color="CCCCCC" w:sz="2"/>
+              <w:bottom w:val="single" w:color="CCCCCC" w:sz="2"/>
+              <w:right w:val="single" w:color="CCCCCC" w:sz="2"/>
+            </w:tcBorders>
+            <w:shd w:fill="FFFFFF" w:val="clear"/>
+            <w:tcMar>
+              <w:top w:type="dxa" w:w="80"/>
+              <w:left w:type="dxa" w:w="120"/>
+              <w:bottom w:type="dxa" w:w="80"/>
+              <w:right w:type="dxa" w:w="120"/>
+            </w:tcMar>
+          </w:tcPr>
+          <w:p>
+            <w:pPr>
+              <w:spacing w:after="20" w:line="270"/>
+            </w:pPr>
+            <w:r>
+              <w:rPr>
+                <w:b w:val="false"/>
+                <w:bCs w:val="false"/>
+                <w:color w:val="1A1A1A"/>
+                <w:sz w:val="20"/>
+                <w:szCs w:val="20"/>
+              </w:rPr>
+              <w:t xml:space="preserve">Source</w:t>
+            </w:r>
+          </w:p>
+        </w:tc>
+        <w:tc>
+          <w:tcPr>
+            <w:tcW w:type="dxa" w:w="3580"/>
+            <w:tcBorders>
+              <w:top w:val="single" w:color="CCCCCC" w:sz="2"/>
+              <w:left w:val="single" w:color="CCCCCC" w:sz="2"/>
+              <w:bottom w:val="single" w:color="CCCCCC" w:sz="2"/>
+              <w:right w:val="single" w:color="CCCCCC" w:sz="2"/>
+            </w:tcBorders>
+            <w:shd w:fill="FFFFFF" w:val="clear"/>
+            <w:tcMar>
+              <w:top w:type="dxa" w:w="80"/>
+              <w:left w:type="dxa" w:w="120"/>
+              <w:bottom w:type="dxa" w:w="80"/>
+              <w:right w:type="dxa" w:w="120"/>
+            </w:tcMar>
+          </w:tcPr>
+          <w:p>
+            <w:pPr>
+              <w:spacing w:after="20" w:line="270"/>
+            </w:pPr>
+            <w:r>
+              <w:rPr>
+                <w:b w:val="false"/>
+                <w:bCs w:val="false"/>
+                <w:color w:val="1A1A1A"/>
+                <w:sz w:val="20"/>
+                <w:szCs w:val="20"/>
+              </w:rPr>
+              <w:t xml:space="preserve">GeoJSON uMap, récupéré périodiquement et stocké.</w:t>
+            </w:r>
+          </w:p>
+        </w:tc>
+        <w:tc>
+          <w:tcPr>
+            <w:tcW w:type="dxa" w:w="3580"/>
+            <w:tcBorders>
+              <w:top w:val="single" w:color="CCCCCC" w:sz="2"/>
+              <w:left w:val="single" w:color="CCCCCC" w:sz="2"/>
+              <w:bottom w:val="single" w:color="CCCCCC" w:sz="2"/>
+              <w:right w:val="single" w:color="CCCCCC" w:sz="2"/>
+            </w:tcBorders>
+            <w:shd w:fill="FFFFFF" w:val="clear"/>
+            <w:tcMar>
+              <w:top w:type="dxa" w:w="80"/>
+              <w:left w:type="dxa" w:w="120"/>
+              <w:bottom w:type="dxa" w:w="80"/>
+              <w:right w:type="dxa" w:w="120"/>
+            </w:tcMar>
+          </w:tcPr>
+          <w:p>
+            <w:pPr>
+              <w:spacing w:after="20" w:line="270"/>
+            </w:pPr>
+            <w:r>
+              <w:rPr>
+                <w:b w:val="false"/>
+                <w:bCs w:val="false"/>
+                <w:color w:val="1A1A1A"/>
+                <w:sz w:val="20"/>
+                <w:szCs w:val="20"/>
+              </w:rPr>
+              <w:t xml:space="preserve">Table des bibliothèques, filtrée sur les bibliothèques actives ayant consenti à l’affichage.</w:t>
+            </w:r>
+          </w:p>
+        </w:tc>
+      </w:tr>
+      <w:tr>
+        <w:trPr>
+          <w:tblHeader w:val="false"/>
+        </w:trPr>
+        <w:tc>
+          <w:tcPr>
+            <w:tcW w:type="dxa" w:w="2200"/>
+            <w:tcBorders>
+              <w:top w:val="single" w:color="CCCCCC" w:sz="2"/>
+              <w:left w:val="single" w:color="CCCCCC" w:sz="2"/>
+              <w:bottom w:val="single" w:color="CCCCCC" w:sz="2"/>
+              <w:right w:val="single" w:color="CCCCCC" w:sz="2"/>
+            </w:tcBorders>
+            <w:shd w:fill="FFFFFF" w:val="clear"/>
+            <w:tcMar>
+              <w:top w:type="dxa" w:w="80"/>
+              <w:left w:type="dxa" w:w="120"/>
+              <w:bottom w:type="dxa" w:w="80"/>
+              <w:right w:type="dxa" w:w="120"/>
+            </w:tcMar>
+          </w:tcPr>
+          <w:p>
+            <w:pPr>
+              <w:spacing w:after="20" w:line="270"/>
+            </w:pPr>
+            <w:r>
+              <w:rPr>
+                <w:b w:val="false"/>
+                <w:bCs w:val="false"/>
+                <w:color w:val="1A1A1A"/>
+                <w:sz w:val="20"/>
+                <w:szCs w:val="20"/>
+              </w:rPr>
+              <w:t xml:space="preserve">Source de vérité</w:t>
+            </w:r>
+          </w:p>
+        </w:tc>
+        <w:tc>
+          <w:tcPr>
+            <w:tcW w:type="dxa" w:w="3580"/>
+            <w:tcBorders>
+              <w:top w:val="single" w:color="CCCCCC" w:sz="2"/>
+              <w:left w:val="single" w:color="CCCCCC" w:sz="2"/>
+              <w:bottom w:val="single" w:color="CCCCCC" w:sz="2"/>
+              <w:right w:val="single" w:color="CCCCCC" w:sz="2"/>
+            </w:tcBorders>
+            <w:shd w:fill="FFFFFF" w:val="clear"/>
+            <w:tcMar>
+              <w:top w:type="dxa" w:w="80"/>
+              <w:left w:type="dxa" w:w="120"/>
+              <w:bottom w:type="dxa" w:w="80"/>
+              <w:right w:type="dxa" w:w="120"/>
+            </w:tcMar>
+          </w:tcPr>
+          <w:p>
+            <w:pPr>
+              <w:spacing w:after="20" w:line="270"/>
+            </w:pPr>
+            <w:r>
+              <w:rPr>
+                <w:b w:val="false"/>
+                <w:bCs w:val="false"/>
+                <w:color w:val="1A1A1A"/>
+                <w:sz w:val="20"/>
+                <w:szCs w:val="20"/>
+              </w:rPr>
+              <w:t xml:space="preserve">uMap (édition militante hors AnarBib).</w:t>
+            </w:r>
+          </w:p>
+        </w:tc>
+        <w:tc>
+          <w:tcPr>
+            <w:tcW w:type="dxa" w:w="3580"/>
+            <w:tcBorders>
+              <w:top w:val="single" w:color="CCCCCC" w:sz="2"/>
+              <w:left w:val="single" w:color="CCCCCC" w:sz="2"/>
+              <w:bottom w:val="single" w:color="CCCCCC" w:sz="2"/>
+              <w:right w:val="single" w:color="CCCCCC" w:sz="2"/>
+            </w:tcBorders>
+            <w:shd w:fill="FFFFFF" w:val="clear"/>
+            <w:tcMar>
+              <w:top w:type="dxa" w:w="80"/>
+              <w:left w:type="dxa" w:w="120"/>
+              <w:bottom w:type="dxa" w:w="80"/>
+              <w:right w:type="dxa" w:w="120"/>
+            </w:tcMar>
+          </w:tcPr>
+          <w:p>
+            <w:pPr>
+              <w:spacing w:after="20" w:line="270"/>
+            </w:pPr>
+            <w:r>
+              <w:rPr>
+                <w:b w:val="false"/>
+                <w:bCs w:val="false"/>
+                <w:color w:val="1A1A1A"/>
+                <w:sz w:val="20"/>
+                <w:szCs w:val="20"/>
+              </w:rPr>
+              <w:t xml:space="preserve">AnarBib — jamais uMap. La géolocalisation d’un membre vient de sa fiche dans l’outil.</w:t>
+            </w:r>
+          </w:p>
+        </w:tc>
+      </w:tr>
+      <w:tr>
+        <w:trPr>
+          <w:tblHeader w:val="false"/>
+        </w:trPr>
+        <w:tc>
+          <w:tcPr>
+            <w:tcW w:type="dxa" w:w="2200"/>
+            <w:tcBorders>
+              <w:top w:val="single" w:color="CCCCCC" w:sz="2"/>
+              <w:left w:val="single" w:color="CCCCCC" w:sz="2"/>
+              <w:bottom w:val="single" w:color="CCCCCC" w:sz="2"/>
+              <w:right w:val="single" w:color="CCCCCC" w:sz="2"/>
+            </w:tcBorders>
+            <w:shd w:fill="FFFFFF" w:val="clear"/>
+            <w:tcMar>
+              <w:top w:type="dxa" w:w="80"/>
+              <w:left w:type="dxa" w:w="120"/>
+              <w:bottom w:type="dxa" w:w="80"/>
+              <w:right w:type="dxa" w:w="120"/>
+            </w:tcMar>
+          </w:tcPr>
+          <w:p>
+            <w:pPr>
+              <w:spacing w:after="20" w:line="270"/>
+            </w:pPr>
+            <w:r>
+              <w:rPr>
+                <w:b w:val="false"/>
+                <w:bCs w:val="false"/>
+                <w:color w:val="1A1A1A"/>
+                <w:sz w:val="20"/>
+                <w:szCs w:val="20"/>
+              </w:rPr>
+              <w:t xml:space="preserve">Rendu</w:t>
+            </w:r>
+          </w:p>
+        </w:tc>
+        <w:tc>
+          <w:tcPr>
+            <w:tcW w:type="dxa" w:w="3580"/>
+            <w:tcBorders>
+              <w:top w:val="single" w:color="CCCCCC" w:sz="2"/>
+              <w:left w:val="single" w:color="CCCCCC" w:sz="2"/>
+              <w:bottom w:val="single" w:color="CCCCCC" w:sz="2"/>
+              <w:right w:val="single" w:color="CCCCCC" w:sz="2"/>
+            </w:tcBorders>
+            <w:shd w:fill="FFFFFF" w:val="clear"/>
+            <w:tcMar>
+              <w:top w:type="dxa" w:w="80"/>
+              <w:left w:type="dxa" w:w="120"/>
+              <w:bottom w:type="dxa" w:w="80"/>
+              <w:right w:type="dxa" w:w="120"/>
+            </w:tcMar>
+          </w:tcPr>
+          <w:p>
+            <w:pPr>
+              <w:spacing w:after="20" w:line="270"/>
+            </w:pPr>
+            <w:r>
+              <w:rPr>
+                <w:b w:val="false"/>
+                <w:bCs w:val="false"/>
+                <w:color w:val="1A1A1A"/>
+                <w:sz w:val="20"/>
+                <w:szCs w:val="20"/>
+              </w:rPr>
+              <w:t xml:space="preserve">Marqueurs sobres et neutres.</w:t>
+            </w:r>
+          </w:p>
+        </w:tc>
+        <w:tc>
+          <w:tcPr>
+            <w:tcW w:type="dxa" w:w="3580"/>
+            <w:tcBorders>
+              <w:top w:val="single" w:color="CCCCCC" w:sz="2"/>
+              <w:left w:val="single" w:color="CCCCCC" w:sz="2"/>
+              <w:bottom w:val="single" w:color="CCCCCC" w:sz="2"/>
+              <w:right w:val="single" w:color="CCCCCC" w:sz="2"/>
+            </w:tcBorders>
+            <w:shd w:fill="FFFFFF" w:val="clear"/>
+            <w:tcMar>
+              <w:top w:type="dxa" w:w="80"/>
+              <w:left w:type="dxa" w:w="120"/>
+              <w:bottom w:type="dxa" w:w="80"/>
+              <w:right w:type="dxa" w:w="120"/>
+            </w:tcMar>
+          </w:tcPr>
+          <w:p>
+            <w:pPr>
+              <w:spacing w:after="20" w:line="270"/>
+            </w:pPr>
+            <w:r>
+              <w:rPr>
+                <w:b w:val="false"/>
+                <w:bCs w:val="false"/>
+                <w:color w:val="1A1A1A"/>
+                <w:sz w:val="20"/>
+                <w:szCs w:val="20"/>
+              </w:rPr>
+              <w:t xml:space="preserve">Marqueurs distinctifs : couleur de marque, logo de la bibliothèque.</w:t>
+            </w:r>
+          </w:p>
+        </w:tc>
+      </w:tr>
+      <w:tr>
+        <w:trPr>
+          <w:tblHeader w:val="false"/>
+        </w:trPr>
+        <w:tc>
+          <w:tcPr>
+            <w:tcW w:type="dxa" w:w="2200"/>
+            <w:tcBorders>
+              <w:top w:val="single" w:color="CCCCCC" w:sz="2"/>
+              <w:left w:val="single" w:color="CCCCCC" w:sz="2"/>
+              <w:bottom w:val="single" w:color="CCCCCC" w:sz="2"/>
+              <w:right w:val="single" w:color="CCCCCC" w:sz="2"/>
+            </w:tcBorders>
+            <w:shd w:fill="FFFFFF" w:val="clear"/>
+            <w:tcMar>
+              <w:top w:type="dxa" w:w="80"/>
+              <w:left w:type="dxa" w:w="120"/>
+              <w:bottom w:type="dxa" w:w="80"/>
+              <w:right w:type="dxa" w:w="120"/>
+            </w:tcMar>
+          </w:tcPr>
+          <w:p>
+            <w:pPr>
+              <w:spacing w:after="20" w:line="270"/>
+            </w:pPr>
+            <w:r>
+              <w:rPr>
+                <w:b w:val="false"/>
+                <w:bCs w:val="false"/>
+                <w:color w:val="1A1A1A"/>
+                <w:sz w:val="20"/>
+                <w:szCs w:val="20"/>
+              </w:rPr>
+              <w:t xml:space="preserve">Interaction</w:t>
+            </w:r>
+          </w:p>
+        </w:tc>
+        <w:tc>
+          <w:tcPr>
+            <w:tcW w:type="dxa" w:w="3580"/>
+            <w:tcBorders>
+              <w:top w:val="single" w:color="CCCCCC" w:sz="2"/>
+              <w:left w:val="single" w:color="CCCCCC" w:sz="2"/>
+              <w:bottom w:val="single" w:color="CCCCCC" w:sz="2"/>
+              <w:right w:val="single" w:color="CCCCCC" w:sz="2"/>
+            </w:tcBorders>
+            <w:shd w:fill="FFFFFF" w:val="clear"/>
+            <w:tcMar>
+              <w:top w:type="dxa" w:w="80"/>
+              <w:left w:type="dxa" w:w="120"/>
+              <w:bottom w:type="dxa" w:w="80"/>
+              <w:right w:type="dxa" w:w="120"/>
+            </w:tcMar>
+          </w:tcPr>
+          <w:p>
+            <w:pPr>
+              <w:spacing w:after="20" w:line="270"/>
+            </w:pPr>
+            <w:r>
+              <w:rPr>
+                <w:b w:val="false"/>
+                <w:bCs w:val="false"/>
+                <w:color w:val="1A1A1A"/>
+                <w:sz w:val="20"/>
+                <w:szCs w:val="20"/>
+              </w:rPr>
+              <w:t xml:space="preserve">Non cliquable vers une fiche AnarBib — il n’y en a pas.</w:t>
+            </w:r>
+          </w:p>
+        </w:tc>
+        <w:tc>
+          <w:tcPr>
+            <w:tcW w:type="dxa" w:w="3580"/>
+            <w:tcBorders>
+              <w:top w:val="single" w:color="CCCCCC" w:sz="2"/>
+              <w:left w:val="single" w:color="CCCCCC" w:sz="2"/>
+              <w:bottom w:val="single" w:color="CCCCCC" w:sz="2"/>
+              <w:right w:val="single" w:color="CCCCCC" w:sz="2"/>
+            </w:tcBorders>
+            <w:shd w:fill="FFFFFF" w:val="clear"/>
+            <w:tcMar>
+              <w:top w:type="dxa" w:w="80"/>
+              <w:left w:type="dxa" w:w="120"/>
+              <w:bottom w:type="dxa" w:w="80"/>
+              <w:right w:type="dxa" w:w="120"/>
+            </w:tcMar>
+          </w:tcPr>
+          <w:p>
+            <w:pPr>
+              <w:spacing w:after="20" w:line="270"/>
+            </w:pPr>
+            <w:r>
+              <w:rPr>
+                <w:b w:val="false"/>
+                <w:bCs w:val="false"/>
+                <w:color w:val="1A1A1A"/>
+                <w:sz w:val="20"/>
+                <w:szCs w:val="20"/>
+              </w:rPr>
+              <w:t xml:space="preserve">Cliquable vers la page publique de la bibliothèque.</w:t>
+            </w:r>
+          </w:p>
+        </w:tc>
+      </w:tr>
+      <w:tr>
+        <w:trPr>
+          <w:tblHeader w:val="false"/>
+        </w:trPr>
+        <w:tc>
+          <w:tcPr>
+            <w:tcW w:type="dxa" w:w="2200"/>
+            <w:tcBorders>
+              <w:top w:val="single" w:color="CCCCCC" w:sz="2"/>
+              <w:left w:val="single" w:color="CCCCCC" w:sz="2"/>
+              <w:bottom w:val="single" w:color="CCCCCC" w:sz="2"/>
+              <w:right w:val="single" w:color="CCCCCC" w:sz="2"/>
+            </w:tcBorders>
+            <w:shd w:fill="FFFFFF" w:val="clear"/>
+            <w:tcMar>
+              <w:top w:type="dxa" w:w="80"/>
+              <w:left w:type="dxa" w:w="120"/>
+              <w:bottom w:type="dxa" w:w="80"/>
+              <w:right w:type="dxa" w:w="120"/>
+            </w:tcMar>
+          </w:tcPr>
+          <w:p>
+            <w:pPr>
+              <w:spacing w:after="20" w:line="270"/>
+            </w:pPr>
+            <w:r>
+              <w:rPr>
+                <w:b w:val="false"/>
+                <w:bCs w:val="false"/>
+                <w:color w:val="1A1A1A"/>
+                <w:sz w:val="20"/>
+                <w:szCs w:val="20"/>
+              </w:rPr>
+              <w:t xml:space="preserve">Hiérarchie visuelle</w:t>
+            </w:r>
+          </w:p>
+        </w:tc>
+        <w:tc>
+          <w:tcPr>
+            <w:tcW w:type="dxa" w:w="3580"/>
+            <w:tcBorders>
+              <w:top w:val="single" w:color="CCCCCC" w:sz="2"/>
+              <w:left w:val="single" w:color="CCCCCC" w:sz="2"/>
+              <w:bottom w:val="single" w:color="CCCCCC" w:sz="2"/>
+              <w:right w:val="single" w:color="CCCCCC" w:sz="2"/>
+            </w:tcBorders>
+            <w:shd w:fill="FFFFFF" w:val="clear"/>
+            <w:tcMar>
+              <w:top w:type="dxa" w:w="80"/>
+              <w:left w:type="dxa" w:w="120"/>
+              <w:bottom w:type="dxa" w:w="80"/>
+              <w:right w:type="dxa" w:w="120"/>
+            </w:tcMar>
+          </w:tcPr>
+          <w:p>
+            <w:pPr>
+              <w:spacing w:after="20" w:line="270"/>
+            </w:pPr>
+            <w:r>
+              <w:rPr>
+                <w:b w:val="false"/>
+                <w:bCs w:val="false"/>
+                <w:color w:val="1A1A1A"/>
+                <w:sz w:val="20"/>
+                <w:szCs w:val="20"/>
+              </w:rPr>
+              <w:t xml:space="preserve">Fond de carte du mouvement.</w:t>
+            </w:r>
+          </w:p>
+        </w:tc>
+        <w:tc>
+          <w:tcPr>
+            <w:tcW w:type="dxa" w:w="3580"/>
+            <w:tcBorders>
+              <w:top w:val="single" w:color="CCCCCC" w:sz="2"/>
+              <w:left w:val="single" w:color="CCCCCC" w:sz="2"/>
+              <w:bottom w:val="single" w:color="CCCCCC" w:sz="2"/>
+              <w:right w:val="single" w:color="CCCCCC" w:sz="2"/>
+            </w:tcBorders>
+            <w:shd w:fill="FFFFFF" w:val="clear"/>
+            <w:tcMar>
+              <w:top w:type="dxa" w:w="80"/>
+              <w:left w:type="dxa" w:w="120"/>
+              <w:bottom w:type="dxa" w:w="80"/>
+              <w:right w:type="dxa" w:w="120"/>
+            </w:tcMar>
+          </w:tcPr>
+          <w:p>
+            <w:pPr>
+              <w:spacing w:after="20" w:line="270"/>
+            </w:pPr>
+            <w:r>
+              <w:rPr>
+                <w:b w:val="false"/>
+                <w:bCs w:val="false"/>
+                <w:color w:val="1A1A1A"/>
+                <w:sz w:val="20"/>
+                <w:szCs w:val="20"/>
+              </w:rPr>
+              <w:t xml:space="preserve">Ressort nettement sur le fond. Message lu d’un coup d’œil : « AnarBib, c’est ces points-là, au sein de ce milieu-là ».</w:t>
+            </w:r>
+          </w:p>
+        </w:tc>
+      </w:tr>
+    </w:tbl>
+    <w:p>
+      <w:pPr>
+        <w:spacing w:after="80"/>
+      </w:pPr>
+      <w:r>
+        <w:t xml:space="preserve"/>
+      </w:r>
+    </w:p>
+    <w:p>
+      <w:pPr>
+        <w:spacing w:after="120" w:line="312"/>
+      </w:pPr>
+      <w:r>
+        <w:rPr>
+          <w:b/>
+          <w:bCs/>
+        </w:rPr>
+        <w:t xml:space="preserve">Lien avec les cercles. </w:t>
+      </w:r>
+      <w:r>
+        <w:t xml:space="preserve">Une fois la primitive cercle en place (section 3), le calque des membres peut se colorer ou se filtrer par cercle — voir d’un coup les bibliothèques d’un cercle géographique, par exemple. La carte cesse alors d’être décorative pour devenir un outil de lecture de la fédération.</w:t>
+      </w:r>
+    </w:p>
+    <w:p>
+      <w:pPr>
+        <w:pStyle w:val="Heading3"/>
+      </w:pPr>
+      <w:r>
+        <w:t xml:space="preserve">Deux points de vigilance</w:t>
+      </w:r>
+    </w:p>
+    <w:p>
+      <w:pPr>
+        <w:pStyle w:val="ListParagraph"/>
+        <w:numPr>
+          <w:ilvl w:val="0"/>
+          <w:numId w:val="2"/>
+        </w:numPr>
+        <w:spacing w:after="60" w:line="300"/>
+      </w:pPr>
+      <w:r>
+        <w:rPr>
+          <w:b/>
+          <w:bCs/>
+        </w:rPr>
+        <w:t xml:space="preserve">Consentement et sécurité. </w:t>
+      </w:r>
+      <w:r>
+        <w:t xml:space="preserve">La carte uMap a été produite hors AnarBib, comme cartographie publique. L’intégrer dans l’application, sous la bannière AnarBib, lui donne un autre statut. Une bibliothèque membre doit pouvoir choisir de ne pas être affichée, ou de n’afficher que sa ville et non son adresse. Ce niveau de visibilité vient de sa fiche dans AnarBib, jamais du calque uMap.</w:t>
+      </w:r>
+    </w:p>
+    <w:p>
+      <w:pPr>
+        <w:pStyle w:val="ListParagraph"/>
+        <w:numPr>
+          <w:ilvl w:val="0"/>
+          <w:numId w:val="2"/>
+        </w:numPr>
+        <w:spacing w:after="60" w:line="300"/>
+      </w:pPr>
+      <w:r>
+        <w:rPr>
+          <w:b/>
+          <w:bCs/>
+        </w:rPr>
+        <w:t xml:space="preserve">Double source. </w:t>
+      </w:r>
+      <w:r>
+        <w:t xml:space="preserve">Le calque milieu (uMap) et le calque membres (base AnarBib) peuvent diverger : une bibliothèque qui déménage, un collectif qui devient membre. La règle « uMap pour le milieu, AnarBib pour les membres » tranche la question et doit être tenue strictement, pour éviter le type de désynchronisation déjà coûteux dans l’histoire du projet.</w:t>
+      </w:r>
+    </w:p>
+    <w:p>
+      <w:pPr>
+        <w:spacing w:after="120" w:line="312"/>
+      </w:pPr>
+      <w:r>
+        <w:rPr>
+          <w:b/>
+          <w:bCs/>
+        </w:rPr>
+        <w:t xml:space="preserve">À spécifier. </w:t>
+      </w:r>
+      <w:r>
+        <w:t xml:space="preserve">Le mécanisme de récupération périodique du GeoJSON uMap — fréquence, stockage, déclenchement — reste léger mais doit être décrit dans la spécification dédiée. Il s’ajoute à la liste de la section 8.2.</w:t>
+      </w:r>
+    </w:p>
+    <w:p>
+      <w:pPr>
+        <w:spacing w:after="80"/>
+      </w:pPr>
+      <w:r>
+        <w:t xml:space="preserve"/>
       </w:r>
     </w:p>
     <w:p>
@@ -7431,6 +8798,19 @@
     </w:p>
     <w:p>
       <w:pPr>
+        <w:pStyle w:val="ListParagraph"/>
+        <w:numPr>
+          <w:ilvl w:val="0"/>
+          <w:numId w:val="2"/>
+        </w:numPr>
+        <w:spacing w:after="60" w:line="300"/>
+      </w:pPr>
+      <w:r>
+        <w:t xml:space="preserve">Le mécanisme de récupération périodique du GeoJSON uMap pour le calque « milieu » de la carte (fréquence, stockage, déclenchement).</w:t>
+      </w:r>
+    </w:p>
+    <w:p>
+      <w:pPr>
         <w:spacing w:after="80"/>
       </w:pPr>
       <w:r>
@@ -7476,7 +8856,7 @@
           <w:sz w:val="18"/>
           <w:szCs w:val="18"/>
         </w:rPr>
-        <w:t xml:space="preserve">Document de travail — version 1 — 25 mai 2026. Aucun code. Préalable à spécification.</w:t>
+        <w:t xml:space="preserve">Document de travail — version 2 — 25 mai 2026, amendé le 26 mai 2026 (section 6.5 bis, carte du réseau). Aucun code. Préalable à spécification.</w:t>
       </w:r>
     </w:p>
     <w:sectPr>

</xml_diff>